<commit_message>
court(wvactapp): opening brief latex gated, counsel at the cover's foot, the conclusion kept with its signature (fb-595.54.66)
Co-Authored-By: Claude Opus 5.5 <noreply@anthropic.com>
</commit_message>
<xml_diff>
--- a/courts/fourth-circuit/west-virginia/state/intermediate-court-of-appeals/opening-brief/usage/OUTPUT-opening-brief.docx
+++ b/courts/fourth-circuit/west-virginia/state/intermediate-court-of-appeals/opening-brief/usage/OUTPUT-opening-brief.docx
@@ -367,7 +367,12 @@
     </w:p>
     <w:p>
       <w:pPr>
-        <w:spacing w:before="1728" w:after="0" w:line="276" w:lineRule="exact"/>
+        <w:spacing w:before="0" w:after="0" w:line="6650" w:lineRule="exact"/>
+      </w:pPr>
+    </w:p>
+    <w:p>
+      <w:pPr>
+        <w:spacing w:before="0" w:after="0" w:line="276" w:lineRule="exact"/>
         <w:ind w:left="4608" w:firstLine="0"/>
         <w:jc w:val="left"/>
       </w:pPr>
@@ -2768,7 +2773,7 @@
         <w:tab/>
       </w:r>
       <w:r>
-        <w:t xml:space="preserve">3, 5, 7</w:t>
+        <w:t xml:space="preserve">3, 5, 8</w:t>
       </w:r>
     </w:p>
     <w:p>
@@ -3054,7 +3059,7 @@
         <w:tab/>
       </w:r>
       <w:r>
-        <w:t xml:space="preserve">7, 8, 10</w:t>
+        <w:t xml:space="preserve">8, 10</w:t>
       </w:r>
     </w:p>
     <w:p>
@@ -4837,7 +4842,7 @@
         <w:pStyle w:val="XdQuoteOnly"/>
       </w:pPr>
       <w:r>
-        <w:t xml:space="preserve">“In the absence of a valid agreement, the Court shall presume that all marital property is to be divided equally between the parties, but may alter this distribution . . . after a consideration of the following: ….. (B) Funds which are separate property.</w:t>
+        <w:t xml:space="preserve">“In the absence of a valid agreement, the Court shall presume that all marital property is to be divided equally between the parties, but may alter this distribution . . . after a consideration of the following: ….. (B) Funds which are separate property.</w:t>
       </w:r>
     </w:p>
     <w:p>
@@ -5104,7 +5109,7 @@
     </w:p>
     <w:p>
       <w:pPr>
-        <w:pStyle w:val="BodyText"/>
+        <w:pStyle w:val="BodyTextKeep"/>
       </w:pPr>
       <w:r>
         <w:t xml:space="preserve">Consequently, the relief which Petitioner seeks here is that which is contemplated under West Virginia Code §48</w:t>
@@ -5136,6 +5141,8 @@
     </w:p>
     <w:p>
       <w:pPr>
+        <w:keepNext/>
+        <w:keepLines/>
         <w:spacing w:before="0" w:after="0" w:line="432" w:lineRule="exact"/>
       </w:pPr>
     </w:p>
@@ -6738,6 +6745,7 @@
     <w:unhideWhenUsed/>
     <w:qFormat/>
     <w:pPr>
+      <w:keepLines/>
       <w:spacing w:before="0" w:after="140" w:line="276" w:lineRule="exact"/>
     </w:pPr>
     <w:rPr>
@@ -6936,6 +6944,15 @@
       <w:ind w:firstLine="0"/>
     </w:pPr>
   </w:style>
+  <w:style w:type="paragraph" w:customStyle="1" w:styleId="BodyTextKeep">
+    <w:name w:val="Body Text Keep"/>
+    <w:basedOn w:val="BodyText"/>
+    <w:qFormat/>
+    <w:pPr>
+      <w:keepNext/>
+      <w:keepLines/>
+    </w:pPr>
+  </w:style>
   <w:style w:type="paragraph" w:customStyle="1" w:styleId="XdList1">
     <w:name w:val="XdList 1"/>
     <w:basedOn w:val="Normal"/>
@@ -6988,6 +7005,33 @@
     <w:pPr>
       <w:spacing w:before="0" w:after="0" w:line="276" w:lineRule="exact"/>
       <w:ind w:left="2160" w:hanging="720"/>
+    </w:pPr>
+  </w:style>
+  <w:style w:type="paragraph" w:customStyle="1" w:styleId="XdQuoteList1">
+    <w:name w:val="Xd Quote List 1"/>
+    <w:basedOn w:val="Normal"/>
+    <w:qFormat/>
+    <w:pPr>
+      <w:spacing w:before="0" w:after="0" w:line="276" w:lineRule="exact"/>
+      <w:ind w:left="1440" w:right="720" w:hanging="720"/>
+    </w:pPr>
+  </w:style>
+  <w:style w:type="paragraph" w:customStyle="1" w:styleId="XdQuoteList2">
+    <w:name w:val="Xd Quote List 2"/>
+    <w:basedOn w:val="Normal"/>
+    <w:qFormat/>
+    <w:pPr>
+      <w:spacing w:before="0" w:after="0" w:line="276" w:lineRule="exact"/>
+      <w:ind w:left="2160" w:right="720" w:hanging="720"/>
+    </w:pPr>
+  </w:style>
+  <w:style w:type="paragraph" w:customStyle="1" w:styleId="XdQuoteList3">
+    <w:name w:val="Xd Quote List 3"/>
+    <w:basedOn w:val="Normal"/>
+    <w:qFormat/>
+    <w:pPr>
+      <w:spacing w:before="0" w:after="0" w:line="276" w:lineRule="exact"/>
+      <w:ind w:left="2880" w:right="720" w:hanging="720"/>
     </w:pPr>
   </w:style>
   <w:style w:type="paragraph" w:customStyle="1" w:styleId="XdQuoteOnly">

</xml_diff>